<commit_message>
Compare upgrades + deeper reports + disclaimers
- Compare view: head-to-head KPI table with A-vs-B %, year-wise %-
  difference line chart (zero-baseline), and a Compare Analysis Report
  button.
- New buildCompareReport: detailed two-scope printable report (styled
  like the home report) with side-by-side metrics, year %-diff table,
  supply composition, verdict, and disclaimer.
- Home report: added Market Concentration & Positioning section (top
  3/5/10 + share of Maharashtra) and a Disclaimer block at the end.
- Word .docx: added Disclaimer & Limitations section.
- reportView raised above masterView so the compare report shows on top.

Co-Authored-By: Claude Opus 4.8 (1M context) <noreply@anthropic.com>
</commit_message>
<xml_diff>
--- a/RERA Easy - Maharashtra Market Analysis.docx
+++ b/RERA Easy - Maharashtra Market Analysis.docx
@@ -131,7 +131,7 @@
           <w:sz w:val="20"/>
           <w:szCs w:val="20"/>
         </w:rPr>
-        <w:t xml:space="preserve">53,536 projects</w:t>
+        <w:t xml:space="preserve">53,095 projects</w:t>
       </w:r>
       <w:r>
         <w:rPr>
@@ -149,7 +149,7 @@
           <w:sz w:val="20"/>
           <w:szCs w:val="20"/>
         </w:rPr>
-        <w:t xml:space="preserve">50.34 L units</w:t>
+        <w:t xml:space="preserve">42.15 L units</w:t>
       </w:r>
       <w:r>
         <w:rPr>
@@ -167,7 +167,7 @@
           <w:sz w:val="20"/>
           <w:szCs w:val="20"/>
         </w:rPr>
-        <w:t xml:space="preserve">34.23 Cr sq. m of carpet area</w:t>
+        <w:t xml:space="preserve">27.24 Cr sq. m of carpet area</w:t>
       </w:r>
       <w:r>
         <w:rPr>
@@ -175,7 +175,7 @@
           <w:sz w:val="20"/>
           <w:szCs w:val="20"/>
         </w:rPr>
-        <w:t xml:space="preserve"> and 28.89 Cr sq. m of sanctioned built-up area across the period 2017–2026. </w:t>
+        <w:t xml:space="preserve"> and 26.70 Cr sq. m of sanctioned built-up area across the period 2017–2026. </w:t>
       </w:r>
       <w:r>
         <w:rPr>
@@ -211,7 +211,7 @@
           <w:sz w:val="20"/>
           <w:szCs w:val="20"/>
         </w:rPr>
-        <w:t xml:space="preserve">38.6% completion rate</w:t>
+        <w:t xml:space="preserve">38.7% completion rate</w:t>
       </w:r>
       <w:r>
         <w:rPr>
@@ -229,7 +229,7 @@
           <w:sz w:val="20"/>
           <w:szCs w:val="20"/>
         </w:rPr>
-        <w:t xml:space="preserve">26.3% lapse rate</w:t>
+        <w:t xml:space="preserve">26.2% lapse rate</w:t>
       </w:r>
       <w:r>
         <w:rPr>
@@ -237,7 +237,7 @@
           <w:sz w:val="20"/>
           <w:szCs w:val="20"/>
         </w:rPr>
-        <w:t xml:space="preserve">, with the average project taking 1,449 days (~4.0 years) to complete.</w:t>
+        <w:t xml:space="preserve">, with the average project taking 1,446 days (~4.0 years) to complete.</w:t>
       </w:r>
     </w:p>
     <w:p>
@@ -276,7 +276,7 @@
           <w:sz w:val="20"/>
           <w:szCs w:val="20"/>
         </w:rPr>
-        <w:t xml:space="preserve">New-launch momentum has effectively plateaued — the last three full years (2023–25) registered 14,425 projects versus 14,393 in 2020–22 (+0%), signalling a market shifting from fresh supply toward absorption and completion of existing inventory.</w:t>
+        <w:t xml:space="preserve">New-launch momentum has effectively plateaued — the last three full years (2023–25) registered 14,366 projects versus 14,306 in 2020–22 (+0%), signalling a market shifting from fresh supply toward absorption and completion of existing inventory.</w:t>
       </w:r>
     </w:p>
     <w:p>
@@ -371,7 +371,7 @@
                 <w:sz w:val="18"/>
                 <w:szCs w:val="18"/>
               </w:rPr>
-              <w:t xml:space="preserve">53,536</w:t>
+              <w:t xml:space="preserve">53,095</w:t>
             </w:r>
           </w:p>
         </w:tc>
@@ -440,7 +440,7 @@
                 <w:sz w:val="18"/>
                 <w:szCs w:val="18"/>
               </w:rPr>
-              <w:t xml:space="preserve">38.6%</w:t>
+              <w:t xml:space="preserve">38.7%</w:t>
             </w:r>
           </w:p>
         </w:tc>
@@ -511,7 +511,7 @@
                 <w:sz w:val="18"/>
                 <w:szCs w:val="18"/>
               </w:rPr>
-              <w:t xml:space="preserve">50.34 L</w:t>
+              <w:t xml:space="preserve">42.15 L</w:t>
             </w:r>
           </w:p>
         </w:tc>
@@ -580,7 +580,7 @@
                 <w:sz w:val="18"/>
                 <w:szCs w:val="18"/>
               </w:rPr>
-              <w:t xml:space="preserve">26.3%</w:t>
+              <w:t xml:space="preserve">26.2%</w:t>
             </w:r>
           </w:p>
         </w:tc>
@@ -651,7 +651,7 @@
                 <w:sz w:val="18"/>
                 <w:szCs w:val="18"/>
               </w:rPr>
-              <w:t xml:space="preserve">19.44 Cr</w:t>
+              <w:t xml:space="preserve">17.88 Cr</w:t>
             </w:r>
           </w:p>
         </w:tc>
@@ -720,7 +720,7 @@
                 <w:sz w:val="18"/>
                 <w:szCs w:val="18"/>
               </w:rPr>
-              <w:t xml:space="preserve">18,785</w:t>
+              <w:t xml:space="preserve">18,644</w:t>
             </w:r>
           </w:p>
         </w:tc>
@@ -791,7 +791,7 @@
                 <w:sz w:val="18"/>
                 <w:szCs w:val="18"/>
               </w:rPr>
-              <w:t xml:space="preserve">34.23 Cr</w:t>
+              <w:t xml:space="preserve">27.24 Cr</w:t>
             </w:r>
           </w:p>
         </w:tc>
@@ -931,7 +931,7 @@
                 <w:sz w:val="18"/>
                 <w:szCs w:val="18"/>
               </w:rPr>
-              <w:t xml:space="preserve">28.89 Cr</w:t>
+              <w:t xml:space="preserve">26.70 Cr</w:t>
             </w:r>
           </w:p>
         </w:tc>
@@ -1000,7 +1000,7 @@
                 <w:sz w:val="18"/>
                 <w:szCs w:val="18"/>
               </w:rPr>
-              <w:t xml:space="preserve">34,030</w:t>
+              <w:t xml:space="preserve">31,746</w:t>
             </w:r>
           </w:p>
         </w:tc>
@@ -1024,7 +1024,7 @@
           <w:sz w:val="20"/>
           <w:szCs w:val="20"/>
         </w:rPr>
-        <w:t xml:space="preserve">Average project size is 94 units and 6,393 sq. m of carpet area. The supply mix by project type:</w:t>
+        <w:t xml:space="preserve">Average project size is 79 units and 5,131 sq. m of carpet area. The supply mix by project type:</w:t>
       </w:r>
     </w:p>
     <w:tbl>
@@ -1219,7 +1219,7 @@
                 <w:sz w:val="17"/>
                 <w:szCs w:val="17"/>
               </w:rPr>
-              <w:t xml:space="preserve">33,674</w:t>
+              <w:t xml:space="preserve">33,427</w:t>
             </w:r>
           </w:p>
         </w:tc>
@@ -1253,7 +1253,7 @@
                 <w:sz w:val="17"/>
                 <w:szCs w:val="17"/>
               </w:rPr>
-              <w:t xml:space="preserve">62.9%</w:t>
+              <w:t xml:space="preserve">63.0%</w:t>
             </w:r>
           </w:p>
         </w:tc>
@@ -1325,7 +1325,7 @@
                 <w:sz w:val="17"/>
                 <w:szCs w:val="17"/>
               </w:rPr>
-              <w:t xml:space="preserve">12,907</w:t>
+              <w:t xml:space="preserve">12,765</w:t>
             </w:r>
           </w:p>
         </w:tc>
@@ -1360,7 +1360,7 @@
                 <w:sz w:val="17"/>
                 <w:szCs w:val="17"/>
               </w:rPr>
-              <w:t xml:space="preserve">24.1%</w:t>
+              <w:t xml:space="preserve">24.0%</w:t>
             </w:r>
           </w:p>
         </w:tc>
@@ -1430,7 +1430,7 @@
                 <w:sz w:val="17"/>
                 <w:szCs w:val="17"/>
               </w:rPr>
-              <w:t xml:space="preserve">2,722</w:t>
+              <w:t xml:space="preserve">2,704</w:t>
             </w:r>
           </w:p>
         </w:tc>
@@ -1536,7 +1536,7 @@
                 <w:sz w:val="17"/>
                 <w:szCs w:val="17"/>
               </w:rPr>
-              <w:t xml:space="preserve">2,394</w:t>
+              <w:t xml:space="preserve">2,377</w:t>
             </w:r>
           </w:p>
         </w:tc>
@@ -1641,7 +1641,7 @@
                 <w:sz w:val="17"/>
                 <w:szCs w:val="17"/>
               </w:rPr>
-              <w:t xml:space="preserve">1,839</w:t>
+              <w:t xml:space="preserve">1,822</w:t>
             </w:r>
           </w:p>
         </w:tc>
@@ -1881,7 +1881,7 @@
                 <w:sz w:val="17"/>
                 <w:szCs w:val="17"/>
               </w:rPr>
-              <w:t xml:space="preserve">14,183</w:t>
+              <w:t xml:space="preserve">13,987</w:t>
             </w:r>
           </w:p>
         </w:tc>
@@ -1915,7 +1915,7 @@
                 <w:sz w:val="17"/>
                 <w:szCs w:val="17"/>
               </w:rPr>
-              <w:t xml:space="preserve">26.5%</w:t>
+              <w:t xml:space="preserve">26.3%</w:t>
             </w:r>
           </w:p>
         </w:tc>
@@ -1987,7 +1987,7 @@
                 <w:sz w:val="17"/>
                 <w:szCs w:val="17"/>
               </w:rPr>
-              <w:t xml:space="preserve">4,234</w:t>
+              <w:t xml:space="preserve">4,184</w:t>
             </w:r>
           </w:p>
         </w:tc>
@@ -2092,7 +2092,7 @@
                 <w:sz w:val="17"/>
                 <w:szCs w:val="17"/>
               </w:rPr>
-              <w:t xml:space="preserve">4,501</w:t>
+              <w:t xml:space="preserve">4,459</w:t>
             </w:r>
           </w:p>
         </w:tc>
@@ -2198,7 +2198,7 @@
                 <w:sz w:val="17"/>
                 <w:szCs w:val="17"/>
               </w:rPr>
-              <w:t xml:space="preserve">3,956</w:t>
+              <w:t xml:space="preserve">3,934</w:t>
             </w:r>
           </w:p>
         </w:tc>
@@ -2303,7 +2303,7 @@
                 <w:sz w:val="17"/>
                 <w:szCs w:val="17"/>
               </w:rPr>
-              <w:t xml:space="preserve">4,533</w:t>
+              <w:t xml:space="preserve">4,500</w:t>
             </w:r>
           </w:p>
         </w:tc>
@@ -2409,7 +2409,7 @@
                 <w:sz w:val="17"/>
                 <w:szCs w:val="17"/>
               </w:rPr>
-              <w:t xml:space="preserve">5,904</w:t>
+              <w:t xml:space="preserve">5,872</w:t>
             </w:r>
           </w:p>
         </w:tc>
@@ -2444,7 +2444,7 @@
                 <w:sz w:val="17"/>
                 <w:szCs w:val="17"/>
               </w:rPr>
-              <w:t xml:space="preserve">11.0%</w:t>
+              <w:t xml:space="preserve">11.1%</w:t>
             </w:r>
           </w:p>
         </w:tc>
@@ -2514,7 +2514,7 @@
                 <w:sz w:val="17"/>
                 <w:szCs w:val="17"/>
               </w:rPr>
-              <w:t xml:space="preserve">5,642</w:t>
+              <w:t xml:space="preserve">5,623</w:t>
             </w:r>
           </w:p>
         </w:tc>
@@ -2548,7 +2548,7 @@
                 <w:sz w:val="17"/>
                 <w:szCs w:val="17"/>
               </w:rPr>
-              <w:t xml:space="preserve">10.5%</w:t>
+              <w:t xml:space="preserve">10.6%</w:t>
             </w:r>
           </w:p>
         </w:tc>
@@ -2620,7 +2620,7 @@
                 <w:sz w:val="17"/>
                 <w:szCs w:val="17"/>
               </w:rPr>
-              <w:t xml:space="preserve">4,503</w:t>
+              <w:t xml:space="preserve">4,482</w:t>
             </w:r>
           </w:p>
         </w:tc>
@@ -2725,7 +2725,7 @@
                 <w:sz w:val="17"/>
                 <w:szCs w:val="17"/>
               </w:rPr>
-              <w:t xml:space="preserve">4,280</w:t>
+              <w:t xml:space="preserve">4,261</w:t>
             </w:r>
           </w:p>
         </w:tc>
@@ -2831,7 +2831,7 @@
                 <w:sz w:val="17"/>
                 <w:szCs w:val="17"/>
               </w:rPr>
-              <w:t xml:space="preserve">1,800</w:t>
+              <w:t xml:space="preserve">1,793</w:t>
             </w:r>
           </w:p>
         </w:tc>
@@ -2882,7 +2882,7 @@
           <w:sz w:val="20"/>
           <w:szCs w:val="20"/>
         </w:rPr>
-        <w:t xml:space="preserve">The 2017 peak (14,183 projects) reflects the launch-year backlog when MahaRERA first opened registrations; trend reading is most reliable from 2018 onward. </w:t>
+        <w:t xml:space="preserve">The 2017 peak (13,987 projects) reflects the launch-year backlog when MahaRERA first opened registrations; trend reading is most reliable from 2018 onward. </w:t>
       </w:r>
       <w:r>
         <w:rPr>
@@ -3273,7 +3273,7 @@
                 <w:sz w:val="17"/>
                 <w:szCs w:val="17"/>
               </w:rPr>
-              <w:t xml:space="preserve">25,515</w:t>
+              <w:t xml:space="preserve">25,279</w:t>
             </w:r>
           </w:p>
         </w:tc>
@@ -3307,7 +3307,7 @@
                 <w:sz w:val="17"/>
                 <w:szCs w:val="17"/>
               </w:rPr>
-              <w:t xml:space="preserve">47.7%</w:t>
+              <w:t xml:space="preserve">47.6%</w:t>
             </w:r>
           </w:p>
         </w:tc>
@@ -3341,7 +3341,7 @@
                 <w:sz w:val="17"/>
                 <w:szCs w:val="17"/>
               </w:rPr>
-              <w:t xml:space="preserve">27.11 L</w:t>
+              <w:t xml:space="preserve">22.90 L</w:t>
             </w:r>
           </w:p>
         </w:tc>
@@ -3443,7 +3443,7 @@
                 <w:sz w:val="17"/>
                 <w:szCs w:val="17"/>
               </w:rPr>
-              <w:t xml:space="preserve">1,550</w:t>
+              <w:t xml:space="preserve">1,545</w:t>
             </w:r>
           </w:p>
         </w:tc>
@@ -3477,7 +3477,7 @@
                 <w:sz w:val="17"/>
                 <w:szCs w:val="17"/>
               </w:rPr>
-              <w:t xml:space="preserve">23,757</w:t>
+              <w:t xml:space="preserve">21,897</w:t>
             </w:r>
           </w:p>
         </w:tc>
@@ -3549,7 +3549,7 @@
                 <w:sz w:val="17"/>
                 <w:szCs w:val="17"/>
               </w:rPr>
-              <w:t xml:space="preserve">16,982</w:t>
+              <w:t xml:space="preserve">16,858</w:t>
             </w:r>
           </w:p>
         </w:tc>
@@ -3584,7 +3584,7 @@
                 <w:sz w:val="17"/>
                 <w:szCs w:val="17"/>
               </w:rPr>
-              <w:t xml:space="preserve">31.7%</w:t>
+              <w:t xml:space="preserve">31.8%</w:t>
             </w:r>
           </w:p>
         </w:tc>
@@ -3619,7 +3619,7 @@
                 <w:sz w:val="17"/>
                 <w:szCs w:val="17"/>
               </w:rPr>
-              <w:t xml:space="preserve">15.30 L</w:t>
+              <w:t xml:space="preserve">13.17 L</w:t>
             </w:r>
           </w:p>
         </w:tc>
@@ -3654,7 +3654,7 @@
                 <w:sz w:val="17"/>
                 <w:szCs w:val="17"/>
               </w:rPr>
-              <w:t xml:space="preserve">38.4%</w:t>
+              <w:t xml:space="preserve">38.5%</w:t>
             </w:r>
           </w:p>
         </w:tc>
@@ -3689,7 +3689,7 @@
                 <w:sz w:val="17"/>
                 <w:szCs w:val="17"/>
               </w:rPr>
-              <w:t xml:space="preserve">28.1%</w:t>
+              <w:t xml:space="preserve">28%</w:t>
             </w:r>
           </w:p>
         </w:tc>
@@ -3724,7 +3724,7 @@
                 <w:sz w:val="17"/>
                 <w:szCs w:val="17"/>
               </w:rPr>
-              <w:t xml:space="preserve">1,377</w:t>
+              <w:t xml:space="preserve">1,375</w:t>
             </w:r>
           </w:p>
         </w:tc>
@@ -3759,7 +3759,7 @@
                 <w:sz w:val="17"/>
                 <w:szCs w:val="17"/>
               </w:rPr>
-              <w:t xml:space="preserve">9,297</w:t>
+              <w:t xml:space="preserve">8,954</w:t>
             </w:r>
           </w:p>
         </w:tc>
@@ -3829,7 +3829,7 @@
                 <w:sz w:val="17"/>
                 <w:szCs w:val="17"/>
               </w:rPr>
-              <w:t xml:space="preserve">4,858</w:t>
+              <w:t xml:space="preserve">4,844</w:t>
             </w:r>
           </w:p>
         </w:tc>
@@ -3897,7 +3897,7 @@
                 <w:sz w:val="17"/>
                 <w:szCs w:val="17"/>
               </w:rPr>
-              <w:t xml:space="preserve">2.48 L</w:t>
+              <w:t xml:space="preserve">2.23 L</w:t>
             </w:r>
           </w:p>
         </w:tc>
@@ -3999,7 +3999,7 @@
                 <w:sz w:val="17"/>
                 <w:szCs w:val="17"/>
               </w:rPr>
-              <w:t xml:space="preserve">1,293</w:t>
+              <w:t xml:space="preserve">1,292</w:t>
             </w:r>
           </w:p>
         </w:tc>
@@ -4033,7 +4033,7 @@
                 <w:sz w:val="17"/>
                 <w:szCs w:val="17"/>
               </w:rPr>
-              <w:t xml:space="preserve">378</w:t>
+              <w:t xml:space="preserve">341</w:t>
             </w:r>
           </w:p>
         </w:tc>
@@ -4105,7 +4105,7 @@
                 <w:sz w:val="17"/>
                 <w:szCs w:val="17"/>
               </w:rPr>
-              <w:t xml:space="preserve">3,250</w:t>
+              <w:t xml:space="preserve">3,208</w:t>
             </w:r>
           </w:p>
         </w:tc>
@@ -4140,7 +4140,7 @@
                 <w:sz w:val="17"/>
                 <w:szCs w:val="17"/>
               </w:rPr>
-              <w:t xml:space="preserve">6.1%</w:t>
+              <w:t xml:space="preserve">6.0%</w:t>
             </w:r>
           </w:p>
         </w:tc>
@@ -4175,7 +4175,7 @@
                 <w:sz w:val="17"/>
                 <w:szCs w:val="17"/>
               </w:rPr>
-              <w:t xml:space="preserve">3.47 L</w:t>
+              <w:t xml:space="preserve">2.22 L</w:t>
             </w:r>
           </w:p>
         </w:tc>
@@ -4245,7 +4245,7 @@
                 <w:sz w:val="17"/>
                 <w:szCs w:val="17"/>
               </w:rPr>
-              <w:t xml:space="preserve">23.7%</w:t>
+              <w:t xml:space="preserve">23.5%</w:t>
             </w:r>
           </w:p>
         </w:tc>
@@ -4280,7 +4280,7 @@
                 <w:sz w:val="17"/>
                 <w:szCs w:val="17"/>
               </w:rPr>
-              <w:t xml:space="preserve">1,360</w:t>
+              <w:t xml:space="preserve">1,357</w:t>
             </w:r>
           </w:p>
         </w:tc>
@@ -4315,7 +4315,7 @@
                 <w:sz w:val="17"/>
                 <w:szCs w:val="17"/>
               </w:rPr>
-              <w:t xml:space="preserve">443</w:t>
+              <w:t xml:space="preserve">400</w:t>
             </w:r>
           </w:p>
         </w:tc>
@@ -4385,7 +4385,7 @@
                 <w:sz w:val="17"/>
                 <w:szCs w:val="17"/>
               </w:rPr>
-              <w:t xml:space="preserve">1,973</w:t>
+              <w:t xml:space="preserve">1,958</w:t>
             </w:r>
           </w:p>
         </w:tc>
@@ -4453,7 +4453,7 @@
                 <w:sz w:val="17"/>
                 <w:szCs w:val="17"/>
               </w:rPr>
-              <w:t xml:space="preserve">1.36 L</w:t>
+              <w:t xml:space="preserve">1.08 L</w:t>
             </w:r>
           </w:p>
         </w:tc>
@@ -4487,7 +4487,7 @@
                 <w:sz w:val="17"/>
                 <w:szCs w:val="17"/>
               </w:rPr>
-              <w:t xml:space="preserve">36.2%</w:t>
+              <w:t xml:space="preserve">36.3%</w:t>
             </w:r>
           </w:p>
         </w:tc>
@@ -4521,7 +4521,7 @@
                 <w:sz w:val="17"/>
                 <w:szCs w:val="17"/>
               </w:rPr>
-              <w:t xml:space="preserve">34.9%</w:t>
+              <w:t xml:space="preserve">34.8%</w:t>
             </w:r>
           </w:p>
         </w:tc>
@@ -4555,7 +4555,7 @@
                 <w:sz w:val="17"/>
                 <w:szCs w:val="17"/>
               </w:rPr>
-              <w:t xml:space="preserve">1,380</w:t>
+              <w:t xml:space="preserve">1,378</w:t>
             </w:r>
           </w:p>
         </w:tc>
@@ -4661,7 +4661,7 @@
                 <w:sz w:val="17"/>
                 <w:szCs w:val="17"/>
               </w:rPr>
-              <w:t xml:space="preserve">705</w:t>
+              <w:t xml:space="preserve">699</w:t>
             </w:r>
           </w:p>
         </w:tc>
@@ -4731,7 +4731,7 @@
                 <w:sz w:val="17"/>
                 <w:szCs w:val="17"/>
               </w:rPr>
-              <w:t xml:space="preserve">41,565</w:t>
+              <w:t xml:space="preserve">34,999</w:t>
             </w:r>
           </w:p>
         </w:tc>
@@ -4766,7 +4766,7 @@
                 <w:sz w:val="17"/>
                 <w:szCs w:val="17"/>
               </w:rPr>
-              <w:t xml:space="preserve">41.7%</w:t>
+              <w:t xml:space="preserve">41.5%</w:t>
             </w:r>
           </w:p>
         </w:tc>
@@ -4871,7 +4871,7 @@
                 <w:sz w:val="17"/>
                 <w:szCs w:val="17"/>
               </w:rPr>
-              <w:t xml:space="preserve">45</w:t>
+              <w:t xml:space="preserve">44</w:t>
             </w:r>
           </w:p>
         </w:tc>
@@ -4941,7 +4941,7 @@
                 <w:sz w:val="17"/>
                 <w:szCs w:val="17"/>
               </w:rPr>
-              <w:t xml:space="preserve">201</w:t>
+              <w:t xml:space="preserve">199</w:t>
             </w:r>
           </w:p>
         </w:tc>
@@ -5009,7 +5009,7 @@
                 <w:sz w:val="17"/>
                 <w:szCs w:val="17"/>
               </w:rPr>
-              <w:t xml:space="preserve">16,116</w:t>
+              <w:t xml:space="preserve">15,871</w:t>
             </w:r>
           </w:p>
         </w:tc>
@@ -5043,7 +5043,7 @@
                 <w:sz w:val="17"/>
                 <w:szCs w:val="17"/>
               </w:rPr>
-              <w:t xml:space="preserve">27.9%</w:t>
+              <w:t xml:space="preserve">27.1%</w:t>
             </w:r>
           </w:p>
         </w:tc>
@@ -5077,7 +5077,7 @@
                 <w:sz w:val="17"/>
                 <w:szCs w:val="17"/>
               </w:rPr>
-              <w:t xml:space="preserve">29.9%</w:t>
+              <w:t xml:space="preserve">30.2%</w:t>
             </w:r>
           </w:p>
         </w:tc>
@@ -5111,7 +5111,7 @@
                 <w:sz w:val="17"/>
                 <w:szCs w:val="17"/>
               </w:rPr>
-              <w:t xml:space="preserve">1,598</w:t>
+              <w:t xml:space="preserve">1,605</w:t>
             </w:r>
           </w:p>
         </w:tc>
@@ -5217,7 +5217,7 @@
                 <w:sz w:val="17"/>
                 <w:szCs w:val="17"/>
               </w:rPr>
-              <w:t xml:space="preserve">51</w:t>
+              <w:t xml:space="preserve">49</w:t>
             </w:r>
           </w:p>
         </w:tc>
@@ -5287,7 +5287,7 @@
                 <w:sz w:val="17"/>
                 <w:szCs w:val="17"/>
               </w:rPr>
-              <w:t xml:space="preserve">4,470</w:t>
+              <w:t xml:space="preserve">3,751</w:t>
             </w:r>
           </w:p>
         </w:tc>
@@ -5322,7 +5322,7 @@
                 <w:sz w:val="17"/>
                 <w:szCs w:val="17"/>
               </w:rPr>
-              <w:t xml:space="preserve">29.4%</w:t>
+              <w:t xml:space="preserve">26.5%</w:t>
             </w:r>
           </w:p>
         </w:tc>
@@ -5357,7 +5357,7 @@
                 <w:sz w:val="17"/>
                 <w:szCs w:val="17"/>
               </w:rPr>
-              <w:t xml:space="preserve">29.4%</w:t>
+              <w:t xml:space="preserve">30.6%</w:t>
             </w:r>
           </w:p>
         </w:tc>
@@ -5392,7 +5392,7 @@
                 <w:sz w:val="17"/>
                 <w:szCs w:val="17"/>
               </w:rPr>
-              <w:t xml:space="preserve">1,637</w:t>
+              <w:t xml:space="preserve">1,647</w:t>
             </w:r>
           </w:p>
         </w:tc>
@@ -5443,7 +5443,7 @@
           <w:sz w:val="20"/>
           <w:szCs w:val="20"/>
         </w:rPr>
-        <w:t xml:space="preserve">Konkan (the Mumbai Metropolitan belt) leads with 25,515 projects (48% of the state), followed by Pune at 32%. Together these two divisions hold roughly 79% of all registered development — the clear focus for volume-led campaigns.</w:t>
+        <w:t xml:space="preserve">Konkan (the Mumbai Metropolitan belt) leads with 25,279 projects (48% of the state), followed by Pune at 32%. Together these two divisions hold roughly 79% of all registered development — the clear focus for volume-led campaigns.</w:t>
       </w:r>
     </w:p>
     <w:p>
@@ -5826,7 +5826,7 @@
                 <w:sz w:val="17"/>
                 <w:szCs w:val="17"/>
               </w:rPr>
-              <w:t xml:space="preserve">13,685</w:t>
+              <w:t xml:space="preserve">13,584</w:t>
             </w:r>
           </w:p>
         </w:tc>
@@ -5894,7 +5894,7 @@
                 <w:sz w:val="17"/>
                 <w:szCs w:val="17"/>
               </w:rPr>
-              <w:t xml:space="preserve">13.20 L</w:t>
+              <w:t xml:space="preserve">11.85 L</w:t>
             </w:r>
           </w:p>
         </w:tc>
@@ -5962,7 +5962,7 @@
                 <w:sz w:val="17"/>
                 <w:szCs w:val="17"/>
               </w:rPr>
-              <w:t xml:space="preserve">27.2%</w:t>
+              <w:t xml:space="preserve">27.1%</w:t>
             </w:r>
           </w:p>
         </w:tc>
@@ -5996,7 +5996,7 @@
                 <w:sz w:val="17"/>
                 <w:szCs w:val="17"/>
               </w:rPr>
-              <w:t xml:space="preserve">1,379</w:t>
+              <w:t xml:space="preserve">1,376</w:t>
             </w:r>
           </w:p>
         </w:tc>
@@ -6030,7 +6030,7 @@
                 <w:sz w:val="17"/>
                 <w:szCs w:val="17"/>
               </w:rPr>
-              <w:t xml:space="preserve">9,020</w:t>
+              <w:t xml:space="preserve">8,694</w:t>
             </w:r>
           </w:p>
         </w:tc>
@@ -6102,7 +6102,7 @@
                 <w:sz w:val="17"/>
                 <w:szCs w:val="17"/>
               </w:rPr>
-              <w:t xml:space="preserve">7,214</w:t>
+              <w:t xml:space="preserve">7,123</w:t>
             </w:r>
           </w:p>
         </w:tc>
@@ -6137,7 +6137,7 @@
                 <w:sz w:val="17"/>
                 <w:szCs w:val="17"/>
               </w:rPr>
-              <w:t xml:space="preserve">13.5%</w:t>
+              <w:t xml:space="preserve">13.4%</w:t>
             </w:r>
           </w:p>
         </w:tc>
@@ -6172,7 +6172,7 @@
                 <w:sz w:val="17"/>
                 <w:szCs w:val="17"/>
               </w:rPr>
-              <w:t xml:space="preserve">10.19 L</w:t>
+              <w:t xml:space="preserve">8.34 L</w:t>
             </w:r>
           </w:p>
         </w:tc>
@@ -6207,7 +6207,7 @@
                 <w:sz w:val="17"/>
                 <w:szCs w:val="17"/>
               </w:rPr>
-              <w:t xml:space="preserve">35.3%</w:t>
+              <w:t xml:space="preserve">35.1%</w:t>
             </w:r>
           </w:p>
         </w:tc>
@@ -6242,7 +6242,7 @@
                 <w:sz w:val="17"/>
                 <w:szCs w:val="17"/>
               </w:rPr>
-              <w:t xml:space="preserve">23.5%</w:t>
+              <w:t xml:space="preserve">23.6%</w:t>
             </w:r>
           </w:p>
         </w:tc>
@@ -6277,7 +6277,7 @@
                 <w:sz w:val="17"/>
                 <w:szCs w:val="17"/>
               </w:rPr>
-              <w:t xml:space="preserve">1,530</w:t>
+              <w:t xml:space="preserve">1,524</w:t>
             </w:r>
           </w:p>
         </w:tc>
@@ -6312,7 +6312,7 @@
                 <w:sz w:val="17"/>
                 <w:szCs w:val="17"/>
               </w:rPr>
-              <w:t xml:space="preserve">5,876</w:t>
+              <w:t xml:space="preserve">5,390</w:t>
             </w:r>
           </w:p>
         </w:tc>
@@ -6382,7 +6382,7 @@
                 <w:sz w:val="17"/>
                 <w:szCs w:val="17"/>
               </w:rPr>
-              <w:t xml:space="preserve">6,487</w:t>
+              <w:t xml:space="preserve">6,452</w:t>
             </w:r>
           </w:p>
         </w:tc>
@@ -6416,7 +6416,7 @@
                 <w:sz w:val="17"/>
                 <w:szCs w:val="17"/>
               </w:rPr>
-              <w:t xml:space="preserve">12.1%</w:t>
+              <w:t xml:space="preserve">12.2%</w:t>
             </w:r>
           </w:p>
         </w:tc>
@@ -6450,7 +6450,7 @@
                 <w:sz w:val="17"/>
                 <w:szCs w:val="17"/>
               </w:rPr>
-              <w:t xml:space="preserve">6.16 L</w:t>
+              <w:t xml:space="preserve">5.71 L</w:t>
             </w:r>
           </w:p>
         </w:tc>
@@ -6484,7 +6484,7 @@
                 <w:sz w:val="17"/>
                 <w:szCs w:val="17"/>
               </w:rPr>
-              <w:t xml:space="preserve">35%</w:t>
+              <w:t xml:space="preserve">35.1%</w:t>
             </w:r>
           </w:p>
         </w:tc>
@@ -6552,7 +6552,7 @@
                 <w:sz w:val="17"/>
                 <w:szCs w:val="17"/>
               </w:rPr>
-              <w:t xml:space="preserve">1,569</w:t>
+              <w:t xml:space="preserve">1,564</w:t>
             </w:r>
           </w:p>
         </w:tc>
@@ -6586,7 +6586,7 @@
                 <w:sz w:val="17"/>
                 <w:szCs w:val="17"/>
               </w:rPr>
-              <w:t xml:space="preserve">11,517</w:t>
+              <w:t xml:space="preserve">10,734</w:t>
             </w:r>
           </w:p>
         </w:tc>
@@ -6658,7 +6658,7 @@
                 <w:sz w:val="17"/>
                 <w:szCs w:val="17"/>
               </w:rPr>
-              <w:t xml:space="preserve">5,710</w:t>
+              <w:t xml:space="preserve">5,658</w:t>
             </w:r>
           </w:p>
         </w:tc>
@@ -6728,7 +6728,7 @@
                 <w:sz w:val="17"/>
                 <w:szCs w:val="17"/>
               </w:rPr>
-              <w:t xml:space="preserve">5.43 L</w:t>
+              <w:t xml:space="preserve">4.14 L</w:t>
             </w:r>
           </w:p>
         </w:tc>
@@ -6833,7 +6833,7 @@
                 <w:sz w:val="17"/>
                 <w:szCs w:val="17"/>
               </w:rPr>
-              <w:t xml:space="preserve">1,433</w:t>
+              <w:t xml:space="preserve">1,428</w:t>
             </w:r>
           </w:p>
         </w:tc>
@@ -6868,7 +6868,7 @@
                 <w:sz w:val="17"/>
                 <w:szCs w:val="17"/>
               </w:rPr>
-              <w:t xml:space="preserve">2,794</w:t>
+              <w:t xml:space="preserve">2,582</w:t>
             </w:r>
           </w:p>
         </w:tc>
@@ -6938,7 +6938,7 @@
                 <w:sz w:val="17"/>
                 <w:szCs w:val="17"/>
               </w:rPr>
-              <w:t xml:space="preserve">4,067</w:t>
+              <w:t xml:space="preserve">4,060</w:t>
             </w:r>
           </w:p>
         </w:tc>
@@ -7006,7 +7006,7 @@
                 <w:sz w:val="17"/>
                 <w:szCs w:val="17"/>
               </w:rPr>
-              <w:t xml:space="preserve">2.00 L</w:t>
+              <w:t xml:space="preserve">1.89 L</w:t>
             </w:r>
           </w:p>
         </w:tc>
@@ -7108,7 +7108,7 @@
                 <w:sz w:val="17"/>
                 <w:szCs w:val="17"/>
               </w:rPr>
-              <w:t xml:space="preserve">1,301</w:t>
+              <w:t xml:space="preserve">1,300</w:t>
             </w:r>
           </w:p>
         </w:tc>
@@ -7142,7 +7142,7 @@
                 <w:sz w:val="17"/>
                 <w:szCs w:val="17"/>
               </w:rPr>
-              <w:t xml:space="preserve">329</w:t>
+              <w:t xml:space="preserve">292</w:t>
             </w:r>
           </w:p>
         </w:tc>
@@ -7214,7 +7214,7 @@
                 <w:sz w:val="17"/>
                 <w:szCs w:val="17"/>
               </w:rPr>
-              <w:t xml:space="preserve">3,098</w:t>
+              <w:t xml:space="preserve">3,058</w:t>
             </w:r>
           </w:p>
         </w:tc>
@@ -7284,7 +7284,7 @@
                 <w:sz w:val="17"/>
                 <w:szCs w:val="17"/>
               </w:rPr>
-              <w:t xml:space="preserve">3.26 L</w:t>
+              <w:t xml:space="preserve">2.83 L</w:t>
             </w:r>
           </w:p>
         </w:tc>
@@ -7319,7 +7319,7 @@
                 <w:sz w:val="17"/>
                 <w:szCs w:val="17"/>
               </w:rPr>
-              <w:t xml:space="preserve">28.7%</w:t>
+              <w:t xml:space="preserve">28.6%</w:t>
             </w:r>
           </w:p>
         </w:tc>
@@ -7354,7 +7354,7 @@
                 <w:sz w:val="17"/>
                 <w:szCs w:val="17"/>
               </w:rPr>
-              <w:t xml:space="preserve">27.8%</w:t>
+              <w:t xml:space="preserve">27.7%</w:t>
             </w:r>
           </w:p>
         </w:tc>
@@ -7389,7 +7389,7 @@
                 <w:sz w:val="17"/>
                 <w:szCs w:val="17"/>
               </w:rPr>
-              <w:t xml:space="preserve">1,665</w:t>
+              <w:t xml:space="preserve">1,663</w:t>
             </w:r>
           </w:p>
         </w:tc>
@@ -7424,7 +7424,7 @@
                 <w:sz w:val="17"/>
                 <w:szCs w:val="17"/>
               </w:rPr>
-              <w:t xml:space="preserve">1,419</w:t>
+              <w:t xml:space="preserve">1,167</w:t>
             </w:r>
           </w:p>
         </w:tc>
@@ -7494,7 +7494,7 @@
                 <w:sz w:val="17"/>
                 <w:szCs w:val="17"/>
               </w:rPr>
-              <w:t xml:space="preserve">2,691</w:t>
+              <w:t xml:space="preserve">2,651</w:t>
             </w:r>
           </w:p>
         </w:tc>
@@ -7562,7 +7562,7 @@
                 <w:sz w:val="17"/>
                 <w:szCs w:val="17"/>
               </w:rPr>
-              <w:t xml:space="preserve">3.12 L</w:t>
+              <w:t xml:space="preserve">1.91 L</w:t>
             </w:r>
           </w:p>
         </w:tc>
@@ -7630,7 +7630,7 @@
                 <w:sz w:val="17"/>
                 <w:szCs w:val="17"/>
               </w:rPr>
-              <w:t xml:space="preserve">22.5%</w:t>
+              <w:t xml:space="preserve">22.3%</w:t>
             </w:r>
           </w:p>
         </w:tc>
@@ -7664,7 +7664,7 @@
                 <w:sz w:val="17"/>
                 <w:szCs w:val="17"/>
               </w:rPr>
-              <w:t xml:space="preserve">1,414</w:t>
+              <w:t xml:space="preserve">1,410</w:t>
             </w:r>
           </w:p>
         </w:tc>
@@ -7698,7 +7698,7 @@
                 <w:sz w:val="17"/>
                 <w:szCs w:val="17"/>
               </w:rPr>
-              <w:t xml:space="preserve">436</w:t>
+              <w:t xml:space="preserve">393</w:t>
             </w:r>
           </w:p>
         </w:tc>
@@ -7770,7 +7770,7 @@
                 <w:sz w:val="17"/>
                 <w:szCs w:val="17"/>
               </w:rPr>
-              <w:t xml:space="preserve">1,455</w:t>
+              <w:t xml:space="preserve">1,447</w:t>
             </w:r>
           </w:p>
         </w:tc>
@@ -7840,7 +7840,7 @@
                 <w:sz w:val="17"/>
                 <w:szCs w:val="17"/>
               </w:rPr>
-              <w:t xml:space="preserve">1.02 L</w:t>
+              <w:t xml:space="preserve">79,542</w:t>
             </w:r>
           </w:p>
         </w:tc>
@@ -7875,7 +7875,7 @@
                 <w:sz w:val="17"/>
                 <w:szCs w:val="17"/>
               </w:rPr>
-              <w:t xml:space="preserve">37.3%</w:t>
+              <w:t xml:space="preserve">37.5%</w:t>
             </w:r>
           </w:p>
         </w:tc>
@@ -7945,7 +7945,7 @@
                 <w:sz w:val="17"/>
                 <w:szCs w:val="17"/>
               </w:rPr>
-              <w:t xml:space="preserve">1,449</w:t>
+              <w:t xml:space="preserve">1,448</w:t>
             </w:r>
           </w:p>
         </w:tc>
@@ -8050,7 +8050,7 @@
                 <w:sz w:val="17"/>
                 <w:szCs w:val="17"/>
               </w:rPr>
-              <w:t xml:space="preserve">1,364</w:t>
+              <w:t xml:space="preserve">1,353</w:t>
             </w:r>
           </w:p>
         </w:tc>
@@ -8118,7 +8118,7 @@
                 <w:sz w:val="17"/>
                 <w:szCs w:val="17"/>
               </w:rPr>
-              <w:t xml:space="preserve">1.30 L</w:t>
+              <w:t xml:space="preserve">1.15 L</w:t>
             </w:r>
           </w:p>
         </w:tc>
@@ -8186,7 +8186,7 @@
                 <w:sz w:val="17"/>
                 <w:szCs w:val="17"/>
               </w:rPr>
-              <w:t xml:space="preserve">27.5%</w:t>
+              <w:t xml:space="preserve">27.4%</w:t>
             </w:r>
           </w:p>
         </w:tc>
@@ -8220,7 +8220,7 @@
                 <w:sz w:val="17"/>
                 <w:szCs w:val="17"/>
               </w:rPr>
-              <w:t xml:space="preserve">1,834</w:t>
+              <w:t xml:space="preserve">1,830</w:t>
             </w:r>
           </w:p>
         </w:tc>
@@ -8254,7 +8254,7 @@
                 <w:sz w:val="17"/>
                 <w:szCs w:val="17"/>
               </w:rPr>
-              <w:t xml:space="preserve">1,931</w:t>
+              <w:t xml:space="preserve">1,804</w:t>
             </w:r>
           </w:p>
         </w:tc>
@@ -8326,7 +8326,7 @@
                 <w:sz w:val="17"/>
                 <w:szCs w:val="17"/>
               </w:rPr>
-              <w:t xml:space="preserve">1,142</w:t>
+              <w:t xml:space="preserve">1,136</w:t>
             </w:r>
           </w:p>
         </w:tc>
@@ -8396,7 +8396,7 @@
                 <w:sz w:val="17"/>
                 <w:szCs w:val="17"/>
               </w:rPr>
-              <w:t xml:space="preserve">62,137</w:t>
+              <w:t xml:space="preserve">51,169</w:t>
             </w:r>
           </w:p>
         </w:tc>
@@ -8431,7 +8431,7 @@
                 <w:sz w:val="17"/>
                 <w:szCs w:val="17"/>
               </w:rPr>
-              <w:t xml:space="preserve">33%</w:t>
+              <w:t xml:space="preserve">33.2%</w:t>
             </w:r>
           </w:p>
         </w:tc>
@@ -8466,7 +8466,7 @@
                 <w:sz w:val="17"/>
                 <w:szCs w:val="17"/>
               </w:rPr>
-              <w:t xml:space="preserve">35%</w:t>
+              <w:t xml:space="preserve">34.8%</w:t>
             </w:r>
           </w:p>
         </w:tc>
@@ -8501,7 +8501,7 @@
                 <w:sz w:val="17"/>
                 <w:szCs w:val="17"/>
               </w:rPr>
-              <w:t xml:space="preserve">1,527</w:t>
+              <w:t xml:space="preserve">1,529</w:t>
             </w:r>
           </w:p>
         </w:tc>
@@ -8536,7 +8536,7 @@
                 <w:sz w:val="17"/>
                 <w:szCs w:val="17"/>
               </w:rPr>
-              <w:t xml:space="preserve">126</w:t>
+              <w:t xml:space="preserve">109</w:t>
             </w:r>
           </w:p>
         </w:tc>
@@ -8606,7 +8606,7 @@
                 <w:sz w:val="17"/>
                 <w:szCs w:val="17"/>
               </w:rPr>
-              <w:t xml:space="preserve">1,130</w:t>
+              <w:t xml:space="preserve">1,127</w:t>
             </w:r>
           </w:p>
         </w:tc>
@@ -8674,7 +8674,7 @@
                 <w:sz w:val="17"/>
                 <w:szCs w:val="17"/>
               </w:rPr>
-              <w:t xml:space="preserve">49,852</w:t>
+              <w:t xml:space="preserve">47,027</w:t>
             </w:r>
           </w:p>
         </w:tc>
@@ -8742,7 +8742,7 @@
                 <w:sz w:val="17"/>
                 <w:szCs w:val="17"/>
               </w:rPr>
-              <w:t xml:space="preserve">31.5%</w:t>
+              <w:t xml:space="preserve">31.4%</w:t>
             </w:r>
           </w:p>
         </w:tc>
@@ -8776,7 +8776,7 @@
                 <w:sz w:val="17"/>
                 <w:szCs w:val="17"/>
               </w:rPr>
-              <w:t xml:space="preserve">1,523</w:t>
+              <w:t xml:space="preserve">1,522</w:t>
             </w:r>
           </w:p>
         </w:tc>
@@ -8882,7 +8882,7 @@
                 <w:sz w:val="17"/>
                 <w:szCs w:val="17"/>
               </w:rPr>
-              <w:t xml:space="preserve">840</w:t>
+              <w:t xml:space="preserve">832</w:t>
             </w:r>
           </w:p>
         </w:tc>
@@ -8952,7 +8952,7 @@
                 <w:sz w:val="17"/>
                 <w:szCs w:val="17"/>
               </w:rPr>
-              <w:t xml:space="preserve">50,884</w:t>
+              <w:t xml:space="preserve">31,669</w:t>
             </w:r>
           </w:p>
         </w:tc>
@@ -8987,7 +8987,7 @@
                 <w:sz w:val="17"/>
                 <w:szCs w:val="17"/>
               </w:rPr>
-              <w:t xml:space="preserve">44.6%</w:t>
+              <w:t xml:space="preserve">45%</w:t>
             </w:r>
           </w:p>
         </w:tc>
@@ -9022,7 +9022,7 @@
                 <w:sz w:val="17"/>
                 <w:szCs w:val="17"/>
               </w:rPr>
-              <w:t xml:space="preserve">24.5%</w:t>
+              <w:t xml:space="preserve">23.9%</w:t>
             </w:r>
           </w:p>
         </w:tc>
@@ -9057,7 +9057,7 @@
                 <w:sz w:val="17"/>
                 <w:szCs w:val="17"/>
               </w:rPr>
-              <w:t xml:space="preserve">1,379</w:t>
+              <w:t xml:space="preserve">1,383</w:t>
             </w:r>
           </w:p>
         </w:tc>
@@ -9196,7 +9196,7 @@
                 <w:sz w:val="17"/>
                 <w:szCs w:val="17"/>
               </w:rPr>
-              <w:t xml:space="preserve">1.4%</w:t>
+              <w:t xml:space="preserve">1.5%</w:t>
             </w:r>
           </w:p>
         </w:tc>
@@ -9438,7 +9438,7 @@
                 <w:sz w:val="17"/>
                 <w:szCs w:val="17"/>
               </w:rPr>
-              <w:t xml:space="preserve">541</w:t>
+              <w:t xml:space="preserve">532</w:t>
             </w:r>
           </w:p>
         </w:tc>
@@ -9508,7 +9508,7 @@
                 <w:sz w:val="17"/>
                 <w:szCs w:val="17"/>
               </w:rPr>
-              <w:t xml:space="preserve">74,604</w:t>
+              <w:t xml:space="preserve">27,913</w:t>
             </w:r>
           </w:p>
         </w:tc>
@@ -9578,7 +9578,7 @@
                 <w:sz w:val="17"/>
                 <w:szCs w:val="17"/>
               </w:rPr>
-              <w:t xml:space="preserve">40.7%</w:t>
+              <w:t xml:space="preserve">40.8%</w:t>
             </w:r>
           </w:p>
         </w:tc>
@@ -9613,7 +9613,7 @@
                 <w:sz w:val="17"/>
                 <w:szCs w:val="17"/>
               </w:rPr>
-              <w:t xml:space="preserve">1,369</w:t>
+              <w:t xml:space="preserve">1,356</w:t>
             </w:r>
           </w:p>
         </w:tc>
@@ -9718,7 +9718,7 @@
                 <w:sz w:val="17"/>
                 <w:szCs w:val="17"/>
               </w:rPr>
-              <w:t xml:space="preserve">512</w:t>
+              <w:t xml:space="preserve">508</w:t>
             </w:r>
           </w:p>
         </w:tc>
@@ -9786,7 +9786,7 @@
                 <w:sz w:val="17"/>
                 <w:szCs w:val="17"/>
               </w:rPr>
-              <w:t xml:space="preserve">27,757</w:t>
+              <w:t xml:space="preserve">25,696</w:t>
             </w:r>
           </w:p>
         </w:tc>
@@ -9820,7 +9820,7 @@
                 <w:sz w:val="17"/>
                 <w:szCs w:val="17"/>
               </w:rPr>
-              <w:t xml:space="preserve">36.1%</w:t>
+              <w:t xml:space="preserve">36%</w:t>
             </w:r>
           </w:p>
         </w:tc>
@@ -9854,7 +9854,7 @@
                 <w:sz w:val="17"/>
                 <w:szCs w:val="17"/>
               </w:rPr>
-              <w:t xml:space="preserve">30.9%</w:t>
+              <w:t xml:space="preserve">30.7%</w:t>
             </w:r>
           </w:p>
         </w:tc>
@@ -9888,7 +9888,7 @@
                 <w:sz w:val="17"/>
                 <w:szCs w:val="17"/>
               </w:rPr>
-              <w:t xml:space="preserve">1,495</w:t>
+              <w:t xml:space="preserve">1,496</w:t>
             </w:r>
           </w:p>
         </w:tc>
@@ -9994,7 +9994,7 @@
                 <w:sz w:val="17"/>
                 <w:szCs w:val="17"/>
               </w:rPr>
-              <w:t xml:space="preserve">479</w:t>
+              <w:t xml:space="preserve">474</w:t>
             </w:r>
           </w:p>
         </w:tc>
@@ -10064,7 +10064,7 @@
                 <w:sz w:val="17"/>
                 <w:szCs w:val="17"/>
               </w:rPr>
-              <w:t xml:space="preserve">31,764</w:t>
+              <w:t xml:space="preserve">20,769</w:t>
             </w:r>
           </w:p>
         </w:tc>
@@ -10099,7 +10099,7 @@
                 <w:sz w:val="17"/>
                 <w:szCs w:val="17"/>
               </w:rPr>
-              <w:t xml:space="preserve">47.2%</w:t>
+              <w:t xml:space="preserve">47%</w:t>
             </w:r>
           </w:p>
         </w:tc>
@@ -10134,7 +10134,7 @@
                 <w:sz w:val="17"/>
                 <w:szCs w:val="17"/>
               </w:rPr>
-              <w:t xml:space="preserve">28.4%</w:t>
+              <w:t xml:space="preserve">28.3%</w:t>
             </w:r>
           </w:p>
         </w:tc>
@@ -10169,7 +10169,7 @@
                 <w:sz w:val="17"/>
                 <w:szCs w:val="17"/>
               </w:rPr>
-              <w:t xml:space="preserve">1,249</w:t>
+              <w:t xml:space="preserve">1,248</w:t>
             </w:r>
           </w:p>
         </w:tc>
@@ -10274,7 +10274,7 @@
                 <w:sz w:val="17"/>
                 <w:szCs w:val="17"/>
               </w:rPr>
-              <w:t xml:space="preserve">431</w:t>
+              <w:t xml:space="preserve">428</w:t>
             </w:r>
           </w:p>
         </w:tc>
@@ -10342,7 +10342,7 @@
                 <w:sz w:val="17"/>
                 <w:szCs w:val="17"/>
               </w:rPr>
-              <w:t xml:space="preserve">25,706</w:t>
+              <w:t xml:space="preserve">19,579</w:t>
             </w:r>
           </w:p>
         </w:tc>
@@ -10410,7 +10410,7 @@
                 <w:sz w:val="17"/>
                 <w:szCs w:val="17"/>
               </w:rPr>
-              <w:t xml:space="preserve">35.7%</w:t>
+              <w:t xml:space="preserve">35.5%</w:t>
             </w:r>
           </w:p>
         </w:tc>
@@ -10444,7 +10444,7 @@
                 <w:sz w:val="17"/>
                 <w:szCs w:val="17"/>
               </w:rPr>
-              <w:t xml:space="preserve">1,232</w:t>
+              <w:t xml:space="preserve">1,233</w:t>
             </w:r>
           </w:p>
         </w:tc>
@@ -10478,7 +10478,7 @@
                 <w:sz w:val="17"/>
                 <w:szCs w:val="17"/>
               </w:rPr>
-              <w:t xml:space="preserve">35</w:t>
+              <w:t xml:space="preserve">34</w:t>
             </w:r>
           </w:p>
         </w:tc>
@@ -10550,7 +10550,7 @@
                 <w:sz w:val="17"/>
                 <w:szCs w:val="17"/>
               </w:rPr>
-              <w:t xml:space="preserve">289</w:t>
+              <w:t xml:space="preserve">287</w:t>
             </w:r>
           </w:p>
         </w:tc>
@@ -10620,7 +10620,7 @@
                 <w:sz w:val="17"/>
                 <w:szCs w:val="17"/>
               </w:rPr>
-              <w:t xml:space="preserve">23,695</w:t>
+              <w:t xml:space="preserve">20,050</w:t>
             </w:r>
           </w:p>
         </w:tc>
@@ -10655,7 +10655,7 @@
                 <w:sz w:val="17"/>
                 <w:szCs w:val="17"/>
               </w:rPr>
-              <w:t xml:space="preserve">67.5%</w:t>
+              <w:t xml:space="preserve">67.6%</w:t>
             </w:r>
           </w:p>
         </w:tc>
@@ -10690,7 +10690,7 @@
                 <w:sz w:val="17"/>
                 <w:szCs w:val="17"/>
               </w:rPr>
-              <w:t xml:space="preserve">18.7%</w:t>
+              <w:t xml:space="preserve">18.5%</w:t>
             </w:r>
           </w:p>
         </w:tc>
@@ -10725,7 +10725,7 @@
                 <w:sz w:val="17"/>
                 <w:szCs w:val="17"/>
               </w:rPr>
-              <w:t xml:space="preserve">1,059</w:t>
+              <w:t xml:space="preserve">1,062</w:t>
             </w:r>
           </w:p>
         </w:tc>
@@ -10784,7 +10784,7 @@
           <w:sz w:val="20"/>
           <w:szCs w:val="20"/>
         </w:rPr>
-        <w:t xml:space="preserve">Supply concentration is high. The top 3 districts (Pune, Thane, Mumbai Suburban) represent 51.2% of registered projects; the top 5 reach 69.4% and the top 10 87.6%. </w:t>
+        <w:t xml:space="preserve">Supply concentration is high. The top 3 districts (Pune, Thane, Mumbai Suburban) represent 51.2% of registered projects; the top 5 reach 69.5% and the top 10 87.6%. </w:t>
       </w:r>
       <w:r>
         <w:rPr>
@@ -10813,7 +10813,7 @@
           <w:sz w:val="20"/>
           <w:szCs w:val="20"/>
         </w:rPr>
-        <w:t xml:space="preserve">Of 53,536 projects, </w:t>
+        <w:t xml:space="preserve">Of 53,095 projects, </w:t>
       </w:r>
       <w:r>
         <w:rPr>
@@ -10824,7 +10824,7 @@
           <w:sz w:val="20"/>
           <w:szCs w:val="20"/>
         </w:rPr>
-        <w:t xml:space="preserve">20,690 (38.6%) are completed</w:t>
+        <w:t xml:space="preserve">20,526 (38.7%) are completed</w:t>
       </w:r>
       <w:r>
         <w:rPr>
@@ -10832,7 +10832,7 @@
           <w:sz w:val="20"/>
           <w:szCs w:val="20"/>
         </w:rPr>
-        <w:t xml:space="preserve">, 18,785 are active/ongoing, and </w:t>
+        <w:t xml:space="preserve">, 18,644 are active/ongoing, and </w:t>
       </w:r>
       <w:r>
         <w:rPr>
@@ -10843,7 +10843,7 @@
           <w:sz w:val="20"/>
           <w:szCs w:val="20"/>
         </w:rPr>
-        <w:t xml:space="preserve">14,061 (26.3%) have lapsed</w:t>
+        <w:t xml:space="preserve">13,925 (26.2%) have lapsed</w:t>
       </w:r>
       <w:r>
         <w:rPr>
@@ -10851,7 +10851,7 @@
           <w:sz w:val="20"/>
           <w:szCs w:val="20"/>
         </w:rPr>
-        <w:t xml:space="preserve">. Registered complaints total 34,030 (0.64 per project).</w:t>
+        <w:t xml:space="preserve">. Registered complaints total 31,746 (0.60 per project).</w:t>
       </w:r>
     </w:p>
     <w:p>
@@ -10887,7 +10887,7 @@
           <w:sz w:val="20"/>
           <w:szCs w:val="20"/>
         </w:rPr>
-        <w:t xml:space="preserve">40.7% lapsed, 31.2% completed (541 projects)</w:t>
+        <w:t xml:space="preserve">40.8% lapsed, 31.2% completed (532 projects)</w:t>
       </w:r>
     </w:p>
     <w:p>
@@ -10915,7 +10915,7 @@
           <w:sz w:val="20"/>
           <w:szCs w:val="20"/>
         </w:rPr>
-        <w:t xml:space="preserve">35.7% lapsed, 43.2% completed (431 projects)</w:t>
+        <w:t xml:space="preserve">35.5% lapsed, 43.2% completed (428 projects)</w:t>
       </w:r>
     </w:p>
     <w:p>
@@ -10943,7 +10943,7 @@
           <w:sz w:val="20"/>
           <w:szCs w:val="20"/>
         </w:rPr>
-        <w:t xml:space="preserve">35% lapsed, 33% completed (1,142 projects)</w:t>
+        <w:t xml:space="preserve">34.8% lapsed, 33.2% completed (1,136 projects)</w:t>
       </w:r>
     </w:p>
     <w:p>
@@ -10971,7 +10971,7 @@
           <w:sz w:val="20"/>
           <w:szCs w:val="20"/>
         </w:rPr>
-        <w:t xml:space="preserve">32.8% lapsed, 37.3% completed (1,455 projects)</w:t>
+        <w:t xml:space="preserve">32.8% lapsed, 37.5% completed (1,447 projects)</w:t>
       </w:r>
     </w:p>
     <w:p>
@@ -10999,7 +10999,7 @@
           <w:sz w:val="20"/>
           <w:szCs w:val="20"/>
         </w:rPr>
-        <w:t xml:space="preserve">31.5% lapsed, 41.7% completed (1,130 projects)</w:t>
+        <w:t xml:space="preserve">31.4% lapsed, 41.7% completed (1,127 projects)</w:t>
       </w:r>
     </w:p>
     <w:p>
@@ -11027,7 +11027,7 @@
           <w:sz w:val="20"/>
           <w:szCs w:val="20"/>
         </w:rPr>
-        <w:t xml:space="preserve">30.9% lapsed, 36.1% completed (512 projects)</w:t>
+        <w:t xml:space="preserve">30.7% lapsed, 36% completed (508 projects)</w:t>
       </w:r>
     </w:p>
     <w:p>
@@ -11063,7 +11063,7 @@
           <w:sz w:val="20"/>
           <w:szCs w:val="20"/>
         </w:rPr>
-        <w:t xml:space="preserve">53.9% completed, 20.3% lapsed (4,067 projects)</w:t>
+        <w:t xml:space="preserve">53.9% completed, 20.3% lapsed (4,060 projects)</w:t>
       </w:r>
     </w:p>
     <w:p>
@@ -11119,7 +11119,7 @@
           <w:sz w:val="20"/>
           <w:szCs w:val="20"/>
         </w:rPr>
-        <w:t xml:space="preserve">47.2% completed, 28.4% lapsed (479 projects)</w:t>
+        <w:t xml:space="preserve">47% completed, 28.3% lapsed (474 projects)</w:t>
       </w:r>
     </w:p>
     <w:p>
@@ -11147,7 +11147,7 @@
           <w:sz w:val="20"/>
           <w:szCs w:val="20"/>
         </w:rPr>
-        <w:t xml:space="preserve">44.6% completed, 24.5% lapsed (840 projects)</w:t>
+        <w:t xml:space="preserve">45% completed, 23.9% lapsed (832 projects)</w:t>
       </w:r>
     </w:p>
     <w:p>
@@ -11175,7 +11175,7 @@
           <w:sz w:val="20"/>
           <w:szCs w:val="20"/>
         </w:rPr>
-        <w:t xml:space="preserve">43.2% completed, 35.7% lapsed (431 projects)</w:t>
+        <w:t xml:space="preserve">43.2% completed, 35.5% lapsed (428 projects)</w:t>
       </w:r>
     </w:p>
     <w:p>
@@ -11203,7 +11203,7 @@
           <w:sz w:val="20"/>
           <w:szCs w:val="20"/>
         </w:rPr>
-        <w:t xml:space="preserve">42% completed, 26.7% lapsed (5,710 projects)</w:t>
+        <w:t xml:space="preserve">42% completed, 26.7% lapsed (5,658 projects)</w:t>
       </w:r>
     </w:p>
     <w:p>
@@ -11267,7 +11267,7 @@
           <w:sz w:val="20"/>
           <w:szCs w:val="20"/>
         </w:rPr>
-        <w:t xml:space="preserve">Nashik, Nagpur, Kolhapur combine scale with above-average completion and below-average lapse — ideal for premium positioning and reliable-delivery messaging.</w:t>
+        <w:t xml:space="preserve">Nashik, Kolhapur combine scale with above-average completion and below-average lapse — ideal for premium positioning and reliable-delivery messaging.</w:t>
       </w:r>
     </w:p>
     <w:p>
@@ -11401,7 +11401,7 @@
           <w:sz w:val="18"/>
           <w:szCs w:val="18"/>
         </w:rPr>
-        <w:t xml:space="preserve">Source: MahaRERA project registry, covering 53,536 registered projects with registration years from 2017 to 2026. Figures are aggregated from registered project filings. </w:t>
+        <w:t xml:space="preserve">Source: MahaRERA project registry, covering 53,095 registered projects with registration years from 2017 to 2026. Figures are aggregated from registered project filings. </w:t>
       </w:r>
       <w:r>
         <w:rPr>
@@ -11411,6 +11411,28 @@
           <w:szCs w:val="18"/>
         </w:rPr>
         <w:t xml:space="preserve">Data cleaning: a small number of records with corrupt carpet-area values and negative completion-day values were excluded from those specific metrics only; all projects are retained in counts. "Completed/Active/Lapsed" reflects the project's current RERA status. "Avg Days to Complete" is the registry's reported average days metric. Areas are in the source units. 2026 figures are year-to-date.</w:t>
+      </w:r>
+    </w:p>
+    <w:p>
+      <w:pPr>
+        <w:pStyle w:val="Heading1"/>
+      </w:pPr>
+      <w:r>
+        <w:t xml:space="preserve">10. Disclaimer &amp; Limitations</w:t>
+      </w:r>
+    </w:p>
+    <w:p>
+      <w:pPr>
+        <w:spacing w:after="120"/>
+      </w:pPr>
+      <w:r>
+        <w:rPr>
+          <w:rFonts w:ascii="Arial" w:cs="Arial" w:eastAsia="Arial" w:hAnsi="Arial"/>
+          <w:color w:val="8A5A3C"/>
+          <w:sz w:val="18"/>
+          <w:szCs w:val="18"/>
+        </w:rPr>
+        <w:t xml:space="preserve">This report is compiled from the MahaRERA public project registry and is provided for market due-diligence and business-development use only. It is indicative and does not constitute investment, legal, financial, or valuation advice. Registration and status data reflect filings as recorded and may lag, contain filing errors, or differ from on-ground outcomes; completion timelines shown are projections, not guarantees. Figures shift when the underlying export is refreshed. Independently verify before making any commercial, purchase, or lending decision. RERA Easy accepts no liability for actions taken on the basis of this information.</w:t>
       </w:r>
     </w:p>
     <w:sectPr>

</xml_diff>